<commit_message>
K7: titles break at the colon, shorter keywords, affiliation and e-mail
The Korean and English titles each left one word on a second line; they
now break after the colon (<br> in 원고.tmpl.md). The keyword line drops
the English gloss of LLM 에이전트 so TextWorld stays on the first line.
Affiliation: 충북대학교 정보통신공학부. Word renders two pages with about
five lines free. The author name is still to be filled in.

Co-Authored-By: Claude Opus 5.5 <noreply@anthropic.com>
</commit_message>
<xml_diff>
--- a/kiis2026f/paper/KIIS2026f_원고.docx
+++ b/kiis2026f/paper/KIIS2026f_원고.docx
@@ -59,7 +59,19 @@
               <w:rPr>
                 <w:rFonts w:ascii="HY중고딕" w:eastAsia="HY중고딕" w:hint="eastAsia"/>
               </w:rPr>
-              <w:t xml:space="preserve">결정 모델을 월드 모델로: LLM 에이전트에서 JEV와 생성형 LLM의 비교</w:t>
+              <w:t xml:space="preserve">결정 모델을 월드 모델로:</w:t>
+            </w:r>
+            <w:r>
+              <w:rPr>
+                <w:rFonts w:ascii="HY중고딕" w:eastAsia="HY중고딕" w:hint="eastAsia"/>
+              </w:rPr>
+              <w:br/>
+            </w:r>
+            <w:r>
+              <w:rPr>
+                <w:rFonts w:ascii="HY중고딕" w:eastAsia="HY중고딕" w:hint="eastAsia"/>
+              </w:rPr>
+              <w:t xml:space="preserve">LLM 에이전트에서 JEV와 생성형 LLM의 비교</w:t>
             </w:r>
           </w:p>
         </w:tc>
@@ -107,7 +119,25 @@
                 <w:bCs/>
                 <w:sz w:val="24"/>
               </w:rPr>
-              <w:t xml:space="preserve">A Decision Model as a World Model: Comparing JEV with Generative LLMs for LLM Agents</w:t>
+              <w:t xml:space="preserve">A Decision Model as a World Model:</w:t>
+            </w:r>
+            <w:r>
+              <w:rPr>
+                <w:rFonts w:ascii="HY중고딕" w:eastAsia="HY중고딕" w:hint="eastAsia"/>
+                <w:b/>
+                <w:bCs/>
+                <w:sz w:val="24"/>
+              </w:rPr>
+              <w:br/>
+            </w:r>
+            <w:r>
+              <w:rPr>
+                <w:rFonts w:ascii="HY중고딕" w:eastAsia="HY중고딕" w:hint="eastAsia"/>
+                <w:b/>
+                <w:bCs/>
+                <w:sz w:val="24"/>
+              </w:rPr>
+              <w:t xml:space="preserve">Comparing JEV with Generative LLMs for LLM Agents</w:t>
             </w:r>
           </w:p>
         </w:tc>
@@ -221,7 +251,7 @@
                 <w:rFonts w:ascii="신명조" w:eastAsia="신명조" w:hAnsi="굴림" w:cs="굴림" w:hint="eastAsia"/>
                 <w:sz w:val="20"/>
               </w:rPr>
-              <w:t xml:space="preserve">(소속 기관 학과)</w:t>
+              <w:t xml:space="preserve">충북대학교 정보통신공학부</w:t>
             </w:r>
           </w:p>
           <w:p>
@@ -240,7 +270,7 @@
                 <w:rFonts w:ascii="신명조" w:eastAsia="신명조" w:hAnsi="굴림" w:cs="굴림" w:hint="eastAsia"/>
                 <w:sz w:val="20"/>
               </w:rPr>
-              <w:t xml:space="preserve">E-mail: (이메일)</w:t>
+              <w:t xml:space="preserve">E-mail: thddydgnl1937@gmail.com</w:t>
             </w:r>
           </w:p>
         </w:tc>
@@ -342,7 +372,7 @@
                 <w:sz w:val="17"/>
                 <w:szCs w:val="17"/>
               </w:rPr>
-              <w:t xml:space="preserve">월드 모델(World Model), LLM 에이전트(LLM Agent), 결정 모델(Decision Model), 파인튜닝(Fine-tuning), TextWorld</w:t>
+              <w:t xml:space="preserve">월드 모델(World Model), LLM 에이전트, 결정 모델(Decision Model), 파인튜닝(Fine-tuning), TextWorld</w:t>
             </w:r>
           </w:p>
         </w:tc>

</xml_diff>

<commit_message>
K7: the author, 송용휘 (Yong-Hwi Song), sole author
Single author, so the affiliation carries no number. Word renders two
pages with about five lines free.

Co-Authored-By: Claude Opus 5.5 <noreply@anthropic.com>
</commit_message>
<xml_diff>
--- a/kiis2026f/paper/KIIS2026f_원고.docx
+++ b/kiis2026f/paper/KIIS2026f_원고.docx
@@ -177,14 +177,7 @@
               <w:rPr>
                 <w:rFonts w:ascii="HY중고딕" w:eastAsia="HY중고딕" w:hint="eastAsia"/>
               </w:rPr>
-              <w:t xml:space="preserve">(저자명)</w:t>
-            </w:r>
-            <w:r>
-              <w:rPr>
-                <w:rFonts w:ascii="HY중고딕" w:eastAsia="HY중고딕" w:hint="eastAsia"/>
-                <w:vertAlign w:val="superscript"/>
-              </w:rPr>
-              <w:t xml:space="preserve">1</w:t>
+              <w:t xml:space="preserve">송용휘</w:t>
             </w:r>
           </w:p>
           <w:p>
@@ -199,7 +192,7 @@
               <w:rPr>
                 <w:rFonts w:ascii="신명조" w:eastAsia="신명조" w:hint="eastAsia"/>
               </w:rPr>
-              <w:t xml:space="preserve">(Author Name)</w:t>
+              <w:t xml:space="preserve">Yong-Hwi Song</w:t>
             </w:r>
           </w:p>
         </w:tc>
@@ -238,14 +231,6 @@
                 <w:sz w:val="20"/>
               </w:rPr>
             </w:pPr>
-            <w:r>
-              <w:rPr>
-                <w:rFonts w:ascii="신명조" w:eastAsia="신명조" w:hAnsi="굴림" w:cs="굴림" w:hint="eastAsia"/>
-                <w:sz w:val="20"/>
-                <w:vertAlign w:val="superscript"/>
-              </w:rPr>
-              <w:t xml:space="preserve">1</w:t>
-            </w:r>
             <w:r>
               <w:rPr>
                 <w:rFonts w:ascii="신명조" w:eastAsia="신명조" w:hAnsi="굴림" w:cs="굴림" w:hint="eastAsia"/>

</xml_diff>

<commit_message>
K7: new title, Keon Myung Lee as co-author, both e-mails, abstract without the English gloss
Co-Authored-By: Claude Fable 5.1 <noreply@anthropic.com>
</commit_message>
<xml_diff>
--- a/kiis2026f/paper/KIIS2026f_원고.docx
+++ b/kiis2026f/paper/KIIS2026f_원고.docx
@@ -59,7 +59,7 @@
               <w:rPr>
                 <w:rFonts w:ascii="HY중고딕" w:eastAsia="HY중고딕" w:hint="eastAsia"/>
               </w:rPr>
-              <w:t xml:space="preserve">결정 모델을 월드 모델로:</w:t>
+              <w:t xml:space="preserve">LLM 에이전트의 월드모델:</w:t>
             </w:r>
             <w:r>
               <w:rPr>
@@ -71,7 +71,7 @@
               <w:rPr>
                 <w:rFonts w:ascii="HY중고딕" w:eastAsia="HY중고딕" w:hint="eastAsia"/>
               </w:rPr>
-              <w:t xml:space="preserve">LLM 에이전트에서 JEV와 생성형 LLM의 비교</w:t>
+              <w:t xml:space="preserve">결정모델과 범용 LLM의 비교</w:t>
             </w:r>
           </w:p>
         </w:tc>
@@ -119,7 +119,7 @@
                 <w:bCs/>
                 <w:sz w:val="24"/>
               </w:rPr>
-              <w:t xml:space="preserve">A Decision Model as a World Model:</w:t>
+              <w:t xml:space="preserve">A World Model for LLM Agents:</w:t>
             </w:r>
             <w:r>
               <w:rPr>
@@ -137,7 +137,7 @@
                 <w:bCs/>
                 <w:sz w:val="24"/>
               </w:rPr>
-              <w:t xml:space="preserve">Comparing JEV with Generative LLMs for LLM Agents</w:t>
+              <w:t xml:space="preserve">Comparing a Decision Model with General-Purpose LLMs</w:t>
             </w:r>
           </w:p>
         </w:tc>
@@ -177,7 +177,7 @@
               <w:rPr>
                 <w:rFonts w:ascii="HY중고딕" w:eastAsia="HY중고딕" w:hint="eastAsia"/>
               </w:rPr>
-              <w:t xml:space="preserve">송용휘</w:t>
+              <w:t xml:space="preserve">송용휘·이건명</w:t>
             </w:r>
           </w:p>
           <w:p>
@@ -192,7 +192,7 @@
               <w:rPr>
                 <w:rFonts w:ascii="신명조" w:eastAsia="신명조" w:hint="eastAsia"/>
               </w:rPr>
-              <w:t xml:space="preserve">Yong-Hwi Song</w:t>
+              <w:t xml:space="preserve">Yong Hwi Song and Keon Myung Lee</w:t>
             </w:r>
           </w:p>
         </w:tc>
@@ -255,7 +255,7 @@
                 <w:rFonts w:ascii="신명조" w:eastAsia="신명조" w:hAnsi="굴림" w:cs="굴림" w:hint="eastAsia"/>
                 <w:sz w:val="20"/>
               </w:rPr>
-              <w:t xml:space="preserve">E-mail: thddydgnl1937@gmail.com</w:t>
+              <w:t xml:space="preserve">E-mail: thddydgnl1937@gmail.com, kmlee@cbnu.ac.kr</w:t>
             </w:r>
           </w:p>
         </w:tc>
@@ -316,7 +316,7 @@
                 <w:sz w:val="17"/>
                 <w:szCs w:val="17"/>
               </w:rPr>
-              <w:t xml:space="preserve">선택지 위의 확률로 답하는 결정 모델(decision model) JEV를 LLM 에이전트의 월드 모델로 쓰는 방법을 제시하고, LLM을 그대로 또는 파인튜닝해 쓰는 방법과 비교한다. TextWorld 과제에서 과제 학습 없이 쓴 JEV의 성공률은 93.4%로, 실패한 행동만 기억하는 에이전트(79.5%)보다 높고 완벽한 예측을 넣은 기준(92.7%)과 구분되지 않았다. 학습 없는 LLM은 선택지로 물으면 83.0%, 다음 상태를 생성하게 하면 59.0%였고, 이 차이는 생성한 상태의 26.0%가 파싱되지 않는 데서 비롯됐다. 전이 6,000개로 파인튜닝한 LLM은 학습한 구조에서 92.7%에 도달했지만, 새 구조에서는 다단계 예측 정확도가 JEV보다 25.6–26.7%p 더 떨어졌다.</w:t>
+              <w:t xml:space="preserve">선택지 위의 확률로 답하는 결정 모델 JEV를 LLM 에이전트의 월드 모델로 쓰는 방법을 제시하고, LLM을 그대로 또는 파인튜닝해 쓰는 방법과 비교한다. TextWorld 과제에서 과제 학습 없이 쓴 JEV의 성공률은 93.4%로, 실패한 행동만 기억하는 에이전트(79.5%)보다 높고 완벽한 예측을 넣은 기준(92.7%)과 구분되지 않았다. 학습 없는 LLM은 선택지로 물으면 83.0%, 다음 상태를 생성하게 하면 59.0%였고, 이 차이는 생성한 상태의 26.0%가 파싱되지 않는 데서 비롯됐다. 전이 6,000개로 파인튜닝한 LLM은 학습한 구조에서 92.7%에 도달했지만, 새 구조에서는 다단계 예측 정확도가 JEV보다 25.6–26.7%p 더 떨어졌다.</w:t>
             </w:r>
           </w:p>
           <w:p>

</xml_diff>

<commit_message>
K7: two affiliations, Keon Myung Lee in the School of Software
Co-Authored-By: Claude Fable 5.1 <noreply@anthropic.com>
</commit_message>
<xml_diff>
--- a/kiis2026f/paper/KIIS2026f_원고.docx
+++ b/kiis2026f/paper/KIIS2026f_원고.docx
@@ -177,7 +177,27 @@
               <w:rPr>
                 <w:rFonts w:ascii="HY중고딕" w:eastAsia="HY중고딕" w:hint="eastAsia"/>
               </w:rPr>
-              <w:t xml:space="preserve">송용휘·이건명</w:t>
+              <w:t xml:space="preserve">송용휘</w:t>
+            </w:r>
+            <w:r>
+              <w:rPr>
+                <w:rFonts w:ascii="HY중고딕" w:eastAsia="HY중고딕" w:hint="eastAsia"/>
+                <w:vertAlign w:val="superscript"/>
+              </w:rPr>
+              <w:t xml:space="preserve">1</w:t>
+            </w:r>
+            <w:r>
+              <w:rPr>
+                <w:rFonts w:ascii="HY중고딕" w:eastAsia="HY중고딕" w:hint="eastAsia"/>
+              </w:rPr>
+              <w:t xml:space="preserve">·이건명</w:t>
+            </w:r>
+            <w:r>
+              <w:rPr>
+                <w:rFonts w:ascii="HY중고딕" w:eastAsia="HY중고딕" w:hint="eastAsia"/>
+                <w:vertAlign w:val="superscript"/>
+              </w:rPr>
+              <w:t xml:space="preserve">2</w:t>
             </w:r>
           </w:p>
           <w:p>
@@ -192,14 +212,34 @@
               <w:rPr>
                 <w:rFonts w:ascii="신명조" w:eastAsia="신명조" w:hint="eastAsia"/>
               </w:rPr>
-              <w:t xml:space="preserve">Yong Hwi Song and Keon Myung Lee</w:t>
+              <w:t xml:space="preserve">Yong Hwi Song</w:t>
+            </w:r>
+            <w:r>
+              <w:rPr>
+                <w:rFonts w:ascii="신명조" w:eastAsia="신명조" w:hint="eastAsia"/>
+                <w:vertAlign w:val="superscript"/>
+              </w:rPr>
+              <w:t xml:space="preserve">1</w:t>
+            </w:r>
+            <w:r>
+              <w:rPr>
+                <w:rFonts w:ascii="신명조" w:eastAsia="신명조" w:hint="eastAsia"/>
+              </w:rPr>
+              <w:t xml:space="preserve"> and Keon Myung Lee</w:t>
+            </w:r>
+            <w:r>
+              <w:rPr>
+                <w:rFonts w:ascii="신명조" w:eastAsia="신명조" w:hint="eastAsia"/>
+                <w:vertAlign w:val="superscript"/>
+              </w:rPr>
+              <w:t xml:space="preserve">2</w:t>
             </w:r>
           </w:p>
         </w:tc>
       </w:tr>
       <w:tr>
         <w:trPr>
-          <w:trHeight w:val="560"/>
+          <w:trHeight w:val="1120"/>
         </w:trPr>
         <w:tc>
           <w:tcPr>
@@ -235,6 +275,14 @@
               <w:rPr>
                 <w:rFonts w:ascii="신명조" w:eastAsia="신명조" w:hAnsi="굴림" w:cs="굴림" w:hint="eastAsia"/>
                 <w:sz w:val="20"/>
+                <w:vertAlign w:val="superscript"/>
+              </w:rPr>
+              <w:t xml:space="preserve">1</w:t>
+            </w:r>
+            <w:r>
+              <w:rPr>
+                <w:rFonts w:ascii="신명조" w:eastAsia="신명조" w:hAnsi="굴림" w:cs="굴림" w:hint="eastAsia"/>
+                <w:sz w:val="20"/>
               </w:rPr>
               <w:t xml:space="preserve">충북대학교 정보통신공학부</w:t>
             </w:r>
@@ -255,7 +303,53 @@
                 <w:rFonts w:ascii="신명조" w:eastAsia="신명조" w:hAnsi="굴림" w:cs="굴림" w:hint="eastAsia"/>
                 <w:sz w:val="20"/>
               </w:rPr>
-              <w:t xml:space="preserve">E-mail: thddydgnl1937@gmail.com, kmlee@cbnu.ac.kr</w:t>
+              <w:t xml:space="preserve">E-mail: thddydgnl1937@gmail.com</w:t>
+            </w:r>
+          </w:p>
+          <w:p>
+            <w:pPr>
+              <w:wordWrap/>
+              <w:spacing w:line="240" w:lineRule="auto"/>
+              <w:ind w:left="300" w:right="300"/>
+              <w:jc w:val="center"/>
+              <w:rPr>
+                <w:rFonts w:hAnsi="굴림" w:cs="굴림"/>
+                <w:sz w:val="20"/>
+              </w:rPr>
+            </w:pPr>
+            <w:r>
+              <w:rPr>
+                <w:rFonts w:ascii="신명조" w:eastAsia="신명조" w:hAnsi="굴림" w:cs="굴림" w:hint="eastAsia"/>
+                <w:sz w:val="20"/>
+                <w:vertAlign w:val="superscript"/>
+              </w:rPr>
+              <w:t xml:space="preserve">2</w:t>
+            </w:r>
+            <w:r>
+              <w:rPr>
+                <w:rFonts w:ascii="신명조" w:eastAsia="신명조" w:hAnsi="굴림" w:cs="굴림" w:hint="eastAsia"/>
+                <w:sz w:val="20"/>
+              </w:rPr>
+              <w:t xml:space="preserve">충북대학교 소프트웨어학부</w:t>
+            </w:r>
+          </w:p>
+          <w:p>
+            <w:pPr>
+              <w:wordWrap/>
+              <w:spacing w:line="240" w:lineRule="auto"/>
+              <w:ind w:left="300" w:right="300"/>
+              <w:jc w:val="center"/>
+              <w:rPr>
+                <w:rFonts w:hAnsi="굴림" w:cs="굴림"/>
+                <w:sz w:val="20"/>
+              </w:rPr>
+            </w:pPr>
+            <w:r>
+              <w:rPr>
+                <w:rFonts w:ascii="신명조" w:eastAsia="신명조" w:hAnsi="굴림" w:cs="굴림" w:hint="eastAsia"/>
+                <w:sz w:val="20"/>
+              </w:rPr>
+              <w:t xml:space="preserve">E-mail: kmlee@cbnu.ac.kr</w:t>
             </w:r>
           </w:p>
         </w:tc>

</xml_diff>